<commit_message>
Final punch list: soften 8 formulations, fix Callon year (2009), fix Reflexis authors (Ye et al. 2026), fix Paseri citation format, restore URLs to §3.2
</commit_message>
<xml_diff>
--- a/supplements/manuscript_final_v2.docx
+++ b/supplements/manuscript_final_v2.docx
@@ -204,7 +204,7 @@
           <w:sz w:val="24"/>
           <w:szCs w:val="24"/>
         </w:rPr>
-        <w:t xml:space="preserve">Regulatory design for artificial intelligence is typically framed around developing rules and defining risks. AI governance policies must address who is liable and how compliance will be assessed. As AI systems integrate into broader social and organizational fields, regulatory frameworks evolve through continuous interactions among governmental agencies, standards bodies, technology providers, businesses, and impacted groups. However, to understand how these systems actually operate, the governance of AI must be conceptualized not merely as static law, but as an algorithmic assemblage (Callon et al., 2007). In this view, authority, accountability, and meaning are stabilized through ongoing sociomaterial interactions among heterogeneous actors.</w:t>
+        <w:t xml:space="preserve">Regulatory design for artificial intelligence is typically framed around developing rules and defining risks. AI governance policies must address who is liable and how compliance will be assessed. As AI systems integrate into broader social and organizational fields, regulatory frameworks evolve through continuous interactions among governmental agencies, standards bodies, technology providers, businesses, and impacted groups. However, to understand how these systems actually operate, the governance of AI must be conceptualized not merely as static law, but as an algorithmic assemblage (Callon et al., 2009). In this view, authority, accountability, and meaning are stabilized through ongoing sociomaterial interactions among heterogeneous actors.</w:t>
       </w:r>
     </w:p>
     <w:p>
@@ -284,7 +284,7 @@
           <w:sz w:val="24"/>
           <w:szCs w:val="24"/>
         </w:rPr>
-        <w:t xml:space="preserve">To answer this, the primary contribution of this paper is methodological: we develop and introduce Policy Prism, an LLM-assisted interpretive artifact designed to trace relational dynamics and structural exclusions within policy texts. Through the application of this artifact across five global AI governance configurations (the EU AI Act, Colorado SB 24-205, India's AI Governance Framework, Brazil's PL 2338/2023, and the U.S. Federal assemblage), we surface the Ghost Node as an analytical construct and propose Translational Stratification Theory (TST) as a provisional sensitizing framework for organizing these observations comparatively. We trace how apex technocratic nodes absorb interpretive authority while systematically rendering some affected populations only weakly or selectively legible within governance architectures. Finally, we conclude by offering interpretive propositions for future organizational fieldwork, outlining how these macro-level textual architectures shape the meso-level buffering and decoupling labor of corporate compliance. This paper speaks to the themes animating the </w:t>
+        <w:t xml:space="preserve">To answer this, the primary contribution of this paper is methodological: we develop and introduce Policy Prism, an LLM-assisted interpretive artifact designed to trace relational dynamics and structural exclusions within policy texts. Through the application of this artifact across five global AI governance configurations (the EU AI Act, Colorado SB 24-205, India's AI Governance Framework, Brazil's PL 2338/2023, and the U.S. Federal assemblage), we surface the Ghost Node as an analytical construct and propose Translational Stratification Theory (TST) as a provisional sensitizing framework for organizing these observations comparatively. We trace how apex technocratic nodes concentrate interpretive authority while rendering some affected populations only weakly or selectively legible within governance architectures. Finally, we conclude by offering interpretive propositions for future organizational fieldwork, outlining how these macro-level textual architectures shape the meso-level buffering and decoupling labor of corporate compliance. This paper speaks to the themes animating the </w:t>
       </w:r>
       <w:r>
         <w:rPr>
@@ -443,7 +443,7 @@
           <w:sz w:val="24"/>
           <w:szCs w:val="24"/>
         </w:rPr>
-        <w:t xml:space="preserve"> under which a particular absence serves a stabilizing function. Not every excluded actor is a Ghost Node; only those whose exclusion meets the three criteria below qualify, ensuring analytical precision rather than ontological generality. We do not characterize the lack of inclusion of particular actors as simply institutional oversight; rather, their foreclosure is a recurring stabilizing pattern that is institutionally compatible with the dominant logics of the assemblage (e.g., market harmonization or technocratic control). This institutional compatibility means that these dominant logics can operate without encountering the friction that procedural inclusion would introduce.</w:t>
+        <w:t xml:space="preserve"> under which a particular absence serves a stabilizing function. Not every excluded actor is a Ghost Node; only those whose exclusion meets the three criteria below qualify, ensuring analytical precision rather than ontological generality. We do not characterize the lack of inclusion of particular actors as simply institutional oversight; rather, their foreclosure is a recurring stabilizing pattern that is institutionally compatible with the dominant logics of the assemblage (e.g., market harmonization or technocratic control). This institutional compatibility may allow these dominant logics to operate while reducing the friction that procedural inclusion could introduce.</w:t>
       </w:r>
     </w:p>
     <w:p>
@@ -1084,7 +1084,7 @@
                 <w:sz w:val="24"/>
                 <w:szCs w:val="24"/>
               </w:rPr>
-              <w:t xml:space="preserve">Worker unions are absent from the operative mechanisms of the EU AI Act; their structural foreclosure removes a source of localized political friction, stabilizing a "market-harmonization" logic.</w:t>
+              <w:t xml:space="preserve">Worker unions are absent from the operative mechanisms of the EU AI Act; their structural foreclosure is consistent with a market-harmonization logic that limits localized political friction.</w:t>
             </w:r>
           </w:p>
         </w:tc>
@@ -2450,7 +2450,7 @@
           <w:sz w:val="24"/>
           <w:szCs w:val="24"/>
         </w:rPr>
-        <w:t xml:space="preserve">Policy Prism was developed through an echeloned approach to e-Design Science Research (Tuunanen et al., 2024). It is a Next.js web application utilizing a multi-LLM architecture (GPT-4o for assemblage extraction and structured analysis; GPT-4o-mini for structural parsing). The artifact is publicly deployed and the full source code is openly available (see supplementary materials for URLs). Outputs are subject to three strict design criteria: </w:t>
+        <w:t xml:space="preserve">Policy Prism was developed through an echeloned approach to e-Design Science Research (Tuunanen et al., 2024). It is a Next.js web application utilizing a multi-LLM architecture (GPT-4o for assemblage extraction and structured analysis; GPT-4o-mini for structural parsing). The artifact is publicly deployed at https://policyprism.io and the full source code is available at https://github.com/tsedbrpp/scratch. Outputs are subject to three strict design criteria: </w:t>
       </w:r>
       <w:r>
         <w:rPr>
@@ -2763,7 +2763,7 @@
           <w:sz w:val="24"/>
           <w:szCs w:val="24"/>
         </w:rPr>
-        <w:t xml:space="preserve">One of the most original methodological contributions of this paper is the explicit acknowledgment of a deliberate, recursive irony: we are utilizing an algorithmic assemblage (a multi-LLM architecture) to evaluate the structural inequalities of algorithmic governance. In keeping with interpretive traditions, we do not treat the large language models powering Policy Prism as neutral oracles; they are highly complex sociomaterial actors that possess their own capacities to translate and stratify (Zheng &amp; Lee, 2025; Bender et al., 2021). The idea that the instrument risks reproducing the very politics of legibility it seeks to analyze is central to the artifact's design.</w:t>
+        <w:t xml:space="preserve">One of the most original methodological contributions of this paper is the explicit acknowledgment of a deliberate, recursive irony: we are utilizing an algorithmic assemblage (a multi-LLM architecture) to evaluate the structural inequalities of algorithmic governance. In keeping with interpretive traditions, we do not treat the large language models powering Policy Prism as neutral oracles; they are highly complex sociomaterial actors that possess their own capacities to translate and stratify (Ye et al., 2026; Bender et al., 2021). The idea that the instrument risks reproducing the very politics of legibility it seeks to analyze is central to the artifact's design.</w:t>
       </w:r>
     </w:p>
     <w:p>
@@ -5493,7 +5493,7 @@
           <w:sz w:val="24"/>
           <w:szCs w:val="24"/>
         </w:rPr>
-        <w:t xml:space="preserve">Across all five jurisdictions, authority is concentrated in technocratic apex nodes (e.g., AI Office, AG, ANPD, OMB). These apex nodes operate as Obligatory Passage Points (OPPs) that rely on highly engineered, quantifiable metrics to process compliance at scale. Policy Prism's traces suggest that formally granting affected communities procedural standing to dispute certification or standards would introduce qualitative, context-specific forms of evidence into governance pathways currently designed to process standardized, quantifiable compliance information. The interpretive inference is that these technocratic OPPs were not architecturally designed to accommodate such inputs at scale, and that the structural exclusion of affected populations may function to maintain the throughput and consistency of existing compliance pathways.</w:t>
+        <w:t xml:space="preserve">Across all five jurisdictions, authority is concentrated in technocratic apex nodes (e.g., AI Office, AG, ANPD, OMB). These apex nodes operate as Obligatory Passage Points (OPPs) that rely on highly engineered, quantifiable metrics to process compliance at scale. Policy Prism's traces suggest that formally granting affected communities procedural standing to dispute certification or standards would introduce qualitative, context-specific forms of evidence into governance pathways currently designed to process standardized, quantifiable compliance information. The interpretive inference is that these technocratic OPPs appear better suited to standardized compliance inputs than to qualitative, context-specific claims advanced at scale, and that the structural exclusion of affected populations may function to maintain the throughput and consistency of existing compliance pathways.</w:t>
       </w:r>
     </w:p>
     <w:p>
@@ -5522,7 +5522,7 @@
           <w:sz w:val="24"/>
           <w:szCs w:val="24"/>
         </w:rPr>
-        <w:t xml:space="preserve"> The exclusion of worker organizations across these regimes is neither an accidental nor random omission. Rather, it is a recurring pattern that is institutionally compatible with maintaining the dominant logic in each assemblage. By focusing rhetorical attention on workers while simultaneously excluding them from procedural standing regarding their own rights, each governance architecture neutralizes a potential source of friction. In the counterfactual scenario where worker unions received legal standing to participate in conformity assessment (EU) or enforcement actions (Colorado), substantive questions about working conditions, deployment pace, and error tolerance would enter governance pathways currently insulated from such inputs. Whether this exclusion is a </w:t>
+        <w:t xml:space="preserve"> The exclusion of worker organizations across these regimes is neither an accidental nor random omission. Rather, it is a recurring pattern that is institutionally compatible with maintaining the dominant logic in each assemblage. By focusing rhetorical attention on workers while simultaneously excluding them from procedural standing regarding their own rights, each governance architecture limits a potential source of friction. In the counterfactual scenario where worker unions received legal standing to participate in conformity assessment (EU) or enforcement actions (Colorado), substantive questions about working conditions, deployment pace, and error tolerance would enter governance pathways currently insulated from such inputs. Whether this exclusion is a </w:t>
       </w:r>
       <w:r>
         <w:rPr>
@@ -5885,7 +5885,7 @@
           <w:sz w:val="24"/>
           <w:szCs w:val="24"/>
         </w:rPr>
-        <w:t xml:space="preserve">When macro-governance architectures render workers or affected communities as Ghost Nodes, we propose that this structural absence may cascade to shape internal organizational workflows. Because affected populations lack procedural standing, the daily labor of organizational compliance is likely decoupled from direct, friction-filled community engagement, operating instead as purely technocratic, upward-facing documentation generation.</w:t>
+        <w:t xml:space="preserve">When macro-governance architectures render workers or affected communities as Ghost Nodes, we propose that this structural absence may cascade to shape internal organizational workflows. Because affected populations lack procedural standing in these texts, the daily labor of organizational compliance may become decoupled from direct, friction-filled community engagement, operating instead as purely technocratic, upward-facing documentation generation.</w:t>
       </w:r>
     </w:p>
     <w:p>
@@ -6043,7 +6043,7 @@
           <w:sz w:val="24"/>
           <w:szCs w:val="24"/>
         </w:rPr>
-        <w:t xml:space="preserve">This also implies that simply adding advisory board representation for marginalized groups may not alter the fundamental compliance architecture if the operative enforcement pathways remain unchanged.</w:t>
+        <w:t xml:space="preserve">This suggests that simply adding advisory board representation for marginalized groups may have limited effect if the operative enforcement pathways remain unchanged.</w:t>
       </w:r>
     </w:p>
     <w:p>
@@ -6404,7 +6404,7 @@
           <w:sz w:val="24"/>
           <w:szCs w:val="24"/>
         </w:rPr>
-        <w:t xml:space="preserve">Callon, M., Lascoumes, P., &amp; Barthe, Y. (2007). </w:t>
+        <w:t xml:space="preserve">Callon, M., Lascoumes, P., &amp; Barthe, Y. (2009). </w:t>
       </w:r>
       <w:r>
         <w:rPr>
@@ -7084,7 +7084,7 @@
           <w:sz w:val="24"/>
           <w:szCs w:val="24"/>
         </w:rPr>
-        <w:t xml:space="preserve">. Cambridge University Press, 1-21.</w:t>
+        <w:t xml:space="preserve">, 1, e7.</w:t>
       </w:r>
     </w:p>
     <w:p>
@@ -7306,7 +7306,7 @@
           <w:sz w:val="24"/>
           <w:szCs w:val="24"/>
         </w:rPr>
-        <w:t xml:space="preserve">Zheng, Y., &amp; Lee, A. S. (2025). Reflexis: Supporting reflexivity and rigor in collaborative qualitative analysis through design for deliberation. </w:t>
+        <w:t xml:space="preserve">Ye, R., Huang, O., Lee, P. Y. K., Liut, M., Nobre, C., &amp; Kong, H.-K. (2026). Reflexis: Supporting reflexivity and rigor in collaborative qualitative analysis through design for deliberation. </w:t>
       </w:r>
       <w:r>
         <w:rPr>

</xml_diff>